<commit_message>
Add A* improved heuristic, asymmetric costs and trace output
</commit_message>
<xml_diff>
--- a/Memoria_Practica2.docx
+++ b/Memoria_Practica2.docx
@@ -194,6 +194,12 @@
         <w:t xml:space="preserve"> en Anchura: nodos se insertan al final de Abiertos y se sacan por el principio, siempre encuentra una solución si existe, encuentra la solución de menor coste si todos los pasos cuestan lo mismo</w:t>
       </w:r>
       <w:r>
+        <w:t xml:space="preserve"> y como se indica en el tema 3 de esta asignatura, tiene complejidad temporal y espacial </w:t>
+      </w:r>
+      <w:r>
+        <w:t>O(r^(p+1))</w:t>
+      </w:r>
+      <w:r>
         <w:t>.</w:t>
       </w:r>
     </w:p>
@@ -207,7 +213,19 @@
         <w:jc w:val="both"/>
       </w:pPr>
       <w:r>
-        <w:t>Clase Busqueda en Profundidad: nodos se insertan al principio de Abiertos, no garantiza encontrar la solución óptima, usa menos memoria que Anchura, puede no terminar si el grafo es infinito y no hay limite de profundidad</w:t>
+        <w:t>Clase Busqueda en Profundidad: nodos se insertan al principio de Abiertos,</w:t>
+      </w:r>
+      <w:r>
+        <w:t xml:space="preserve"> según el tema 3, </w:t>
+      </w:r>
+      <w:r>
+        <w:t>no garantiza encontrar la solución óptima</w:t>
+      </w:r>
+      <w:r>
+        <w:t xml:space="preserve"> porque si lo encuentra la meta en profundidad no explora opciones con menos coste</w:t>
+      </w:r>
+      <w:r>
+        <w:t>, usa menos memoria que Anchura, puede no terminar si el grafo es infinito y no hay limite de profundidad</w:t>
       </w:r>
     </w:p>
     <w:p>
@@ -220,17 +238,14 @@
         <w:jc w:val="both"/>
       </w:pPr>
       <w:r>
+        <w:lastRenderedPageBreak/>
         <w:t xml:space="preserve">Clase Busqueda A*: búsqueda informada, usa la función </w:t>
       </w:r>
       <w:r>
         <w:t>f(n) = g(n) + h(n)</w:t>
       </w:r>
       <w:r>
-        <w:t xml:space="preserve">, donde g es el coste real desde el inicio hasta el nodo actual y h la heurística (estimación del coste desde el nodo actual hasta la meta), y como heurística he usado la distancia Manhattan que es la suma de las diferencias absolutas </w:t>
-      </w:r>
-      <w:r>
-        <w:lastRenderedPageBreak/>
-        <w:t xml:space="preserve">de filas y columnas entre el nodo actual y la meta. Mantengo Abiertos ordenado por valor de menor a mayor con el método insertarOrdenado que recorre la lista hasta encontrar la posición correcta. </w:t>
+        <w:t xml:space="preserve">, donde g es el coste real desde el inicio hasta el nodo actual y h la heurística (estimación del coste desde el nodo actual hasta la meta), y como heurística he usado la distancia Manhattan que es la suma de las diferencias absolutas de filas y columnas entre el nodo actual y la meta. Mantengo Abiertos ordenado por valor de menor a mayor con el método insertarOrdenado que recorre la lista hasta encontrar la posición correcta. </w:t>
       </w:r>
     </w:p>
     <w:p>
@@ -245,6 +260,9 @@
       <w:r>
         <w:t>Clase BusquedaA*Mejorado: igual que A* pero he añadido a la heurística los costes de moverse a cada dirección multiplicando las diferencias por 1 o 2 según corresponda. Esto hace que expanda menos nodos y que la estimación sea más ajustada</w:t>
       </w:r>
+      <w:r>
+        <w:t>, pero en MAPA_GRANDE no es admisible</w:t>
+      </w:r>
     </w:p>
     <w:p>
       <w:pPr>
@@ -461,37 +479,22 @@
         <w:t>)</w:t>
       </w:r>
       <w:r>
-        <w:t xml:space="preserve">. El cambio de coste uniforme 1 a estos costes hace que el anchura y ano garantice el camino óptimo porque asume coste uniforme. Solo el A* sigue encontrando el óptimo. </w:t>
-      </w:r>
-    </w:p>
-    <w:p>
-      <w:pPr>
-        <w:jc w:val="both"/>
-      </w:pPr>
-    </w:p>
-    <w:p>
-      <w:pPr>
-        <w:jc w:val="both"/>
-      </w:pPr>
-    </w:p>
-    <w:p>
-      <w:pPr>
-        <w:jc w:val="both"/>
-      </w:pPr>
-    </w:p>
-    <w:p>
-      <w:pPr>
-        <w:jc w:val="both"/>
-      </w:pPr>
-    </w:p>
-    <w:p>
-      <w:pPr>
-        <w:jc w:val="both"/>
-      </w:pPr>
-    </w:p>
-    <w:p>
-      <w:pPr>
-        <w:pStyle w:val="Prrafodelista"/>
+        <w:t>. El cambio de coste uniforme 1 a estos costes hace que el anchura y</w:t>
+      </w:r>
+      <w:r>
+        <w:t xml:space="preserve">a </w:t>
+      </w:r>
+      <w:r>
+        <w:t xml:space="preserve">no garantice el camino óptimo porque asume coste uniforme. Solo el A* sigue encontrando el óptimo. </w:t>
+      </w:r>
+    </w:p>
+    <w:p>
+      <w:pPr>
+        <w:jc w:val="both"/>
+      </w:pPr>
+    </w:p>
+    <w:p>
+      <w:pPr>
         <w:jc w:val="both"/>
       </w:pPr>
     </w:p>
@@ -889,27 +892,9 @@
         <w:pStyle w:val="Prrafodelista"/>
         <w:ind w:left="732"/>
         <w:jc w:val="both"/>
-        <w:rPr>
-          <w:lang w:val="en-US"/>
-        </w:rPr>
-      </w:pPr>
-      <w:r>
-        <w:rPr>
-          <w:lang w:val="en-US"/>
-        </w:rPr>
-        <w:t>Soluci</w:t>
-      </w:r>
-      <w:r>
-        <w:rPr>
-          <w:lang w:val="en-US"/>
-        </w:rPr>
-        <w:t>ó</w:t>
-      </w:r>
-      <w:r>
-        <w:rPr>
-          <w:lang w:val="en-US"/>
-        </w:rPr>
-        <w:t>n:</w:t>
+      </w:pPr>
+      <w:r>
+        <w:t>Solución:</w:t>
       </w:r>
     </w:p>
     <w:p>
@@ -971,7 +956,13 @@
         <w:t xml:space="preserve">En un momento </w:t>
       </w:r>
       <w:r>
-        <w:t>usé addLast pasñandole los abiertos y sucesores, pero me di cuenta que addLast solo acepta un parámetro (el elemento que quiero añadir)</w:t>
+        <w:t xml:space="preserve">usé addLast </w:t>
+      </w:r>
+      <w:r>
+        <w:t>pasándole</w:t>
+      </w:r>
+      <w:r>
+        <w:t xml:space="preserve"> los abiertos y sucesores, pero me di cuenta que addLast solo acepta un parámetro (el elemento que quiero añadir)</w:t>
       </w:r>
     </w:p>
     <w:p>
@@ -1409,7 +1400,10 @@
               <w:jc w:val="both"/>
             </w:pPr>
             <w:r>
-              <w:t>44.77</w:t>
+              <w:t>4</w:t>
+            </w:r>
+            <w:r>
+              <w:t>9.95</w:t>
             </w:r>
           </w:p>
         </w:tc>
@@ -1501,7 +1495,7 @@
               <w:jc w:val="both"/>
             </w:pPr>
             <w:r>
-              <w:t>45.44</w:t>
+              <w:t>39.77</w:t>
             </w:r>
           </w:p>
         </w:tc>
@@ -1563,7 +1557,7 @@
               <w:jc w:val="both"/>
             </w:pPr>
             <w:r>
-              <w:t>14</w:t>
+              <w:t>9</w:t>
             </w:r>
           </w:p>
         </w:tc>
@@ -1593,7 +1587,7 @@
               <w:jc w:val="both"/>
             </w:pPr>
             <w:r>
-              <w:t>48.84</w:t>
+              <w:t>79.55</w:t>
             </w:r>
           </w:p>
         </w:tc>
@@ -1685,7 +1679,7 @@
               <w:jc w:val="both"/>
             </w:pPr>
             <w:r>
-              <w:t>37.48</w:t>
+              <w:t>91.12</w:t>
             </w:r>
           </w:p>
         </w:tc>
@@ -1903,7 +1897,7 @@
               <w:jc w:val="both"/>
             </w:pPr>
             <w:r>
-              <w:t>70.04</w:t>
+              <w:t>58.55</w:t>
             </w:r>
           </w:p>
         </w:tc>
@@ -1995,7 +1989,7 @@
               <w:jc w:val="both"/>
             </w:pPr>
             <w:r>
-              <w:t>69.37</w:t>
+              <w:t>55.26</w:t>
             </w:r>
           </w:p>
         </w:tc>
@@ -2057,7 +2051,7 @@
               <w:jc w:val="both"/>
             </w:pPr>
             <w:r>
-              <w:t>64</w:t>
+              <w:t>58</w:t>
             </w:r>
           </w:p>
         </w:tc>
@@ -2087,7 +2081,7 @@
               <w:jc w:val="both"/>
             </w:pPr>
             <w:r>
-              <w:t>58.19</w:t>
+              <w:t>104.71</w:t>
             </w:r>
           </w:p>
         </w:tc>
@@ -2179,7 +2173,7 @@
               <w:jc w:val="both"/>
             </w:pPr>
             <w:r>
-              <w:t>35.39</w:t>
+              <w:t>105.69</w:t>
             </w:r>
           </w:p>
         </w:tc>
@@ -2254,7 +2248,7 @@
               <w:jc w:val="both"/>
             </w:pPr>
             <w:r>
-              <w:t>COSTE FINAL</w:t>
+              <w:t>COSTE</w:t>
             </w:r>
           </w:p>
         </w:tc>
@@ -2406,7 +2400,7 @@
               <w:jc w:val="both"/>
             </w:pPr>
             <w:r>
-              <w:t>45.25</w:t>
+              <w:t>36.23</w:t>
             </w:r>
           </w:p>
         </w:tc>
@@ -2498,7 +2492,10 @@
               <w:jc w:val="both"/>
             </w:pPr>
             <w:r>
-              <w:t>38.27</w:t>
+              <w:t>3</w:t>
+            </w:r>
+            <w:r>
+              <w:t>2.84</w:t>
             </w:r>
           </w:p>
         </w:tc>
@@ -2590,7 +2587,7 @@
               <w:jc w:val="both"/>
             </w:pPr>
             <w:r>
-              <w:t>53.72</w:t>
+              <w:t>49.54</w:t>
             </w:r>
           </w:p>
         </w:tc>
@@ -2682,7 +2679,7 @@
               <w:jc w:val="both"/>
             </w:pPr>
             <w:r>
-              <w:t>24.42</w:t>
+              <w:t>47.66</w:t>
             </w:r>
           </w:p>
         </w:tc>
@@ -2721,25 +2718,40 @@
         <w:jc w:val="both"/>
       </w:pPr>
       <w:r>
-        <w:t>Con costes uniformes si lo encontraría, pero con distintos costes en distintas direcciones no lo hace. Explora por niveles sin tener en cuenta el coste de cada movimiento, tiene en cuenta el numero de pasos pero no el coste.</w:t>
-      </w:r>
-    </w:p>
-    <w:p>
-      <w:pPr>
-        <w:pStyle w:val="Prrafodelista"/>
-        <w:jc w:val="both"/>
-      </w:pPr>
-      <w:r>
-        <w:t>Fijándonos</w:t>
-      </w:r>
-      <w:r>
-        <w:t xml:space="preserve"> en las tablas anteriores, en el MAPA_CALLEJON anchura encuentra un camino de coste 8 con 8 pasos bajando por la columna izquierda, mientras que profundidad encuentra uno de coste 11 con 10 pasos yendo primero por la fila superior.</w:t>
-      </w:r>
-      <w:r>
-        <w:t xml:space="preserve"> </w:t>
-      </w:r>
-      <w:r>
-        <w:t xml:space="preserve"> En el MAPA_GRANDE se ve que profundidad da coste 35 en vez de 32, lo que confirma que sin tener en cuenta los costes reales el algoritmo puede tomar el camino equivocado.</w:t>
+        <w:t>Con costes uniformes s</w:t>
+      </w:r>
+      <w:r>
+        <w:t>iempre lo encuentra</w:t>
+      </w:r>
+      <w:r>
+        <w:t xml:space="preserve">, pero con distintos costes en distintas direcciones no </w:t>
+      </w:r>
+      <w:r>
+        <w:t xml:space="preserve">siempre </w:t>
+      </w:r>
+      <w:r>
+        <w:t xml:space="preserve">lo hace. Explora por niveles sin tener en cuenta el coste de cada movimiento, tiene en cuenta el </w:t>
+      </w:r>
+      <w:r>
+        <w:t>número</w:t>
+      </w:r>
+      <w:r>
+        <w:t xml:space="preserve"> de pasos.</w:t>
+      </w:r>
+      <w:r>
+        <w:t xml:space="preserve"> Por este motivo en el tema 3 se indica que es óptima en número de pasos porque con costes uniformes esto seria el camino de menor coste. </w:t>
+      </w:r>
+      <w:r>
+        <w:t>Profundidad en cambio si falla porque elige el primer camino que encuentra sin considerar el coste.</w:t>
+      </w:r>
+    </w:p>
+    <w:p>
+      <w:pPr>
+        <w:pStyle w:val="Prrafodelista"/>
+        <w:jc w:val="both"/>
+      </w:pPr>
+      <w:r>
+        <w:t>Fijándonos en las tablas, en el MAPA_CALLEJON anchura encuentra un camino de coste 8 con 8 pasos, igual que A*, mientras que profundidad encuentra uno de coste 11 con 10 pasos yendo primero por la fila superior. En el MAPA_GRANDE se ve lo mismo: anchura da coste 32 igual que A*, pero profundidad da 35, lo que confirma que sin tener en cuenta los costes reales el algoritmo puede tomar el camino equivocado.</w:t>
       </w:r>
     </w:p>
     <w:p>
@@ -2778,7 +2790,11 @@
         <w:t>La heurística podría subestimar el coste real si hay muchos movimientos hacia las direcciones que tienen peso 2. Sin embargo, como la distancia Manhattan usa el coste 1, no sobreestima y encuentra la solución óptima. Es importante resaltar que esto hace que A* tenga que expandir más nodos porque la heurística es menos informada que antes. Para mejorarlo se podría hacer una distancia Manhattan que tuviera en cuenta los pesos hacia cada dirección</w:t>
       </w:r>
       <w:r>
-        <w:t>, que es lo que he implementado como “BusquedaAMejorado” como parte de lo que se pedía en el enunciado “</w:t>
+        <w:t xml:space="preserve">, que es lo que he implementado como “BusquedaAMejorado” como parte de lo que se pedía en el enunciado </w:t>
+      </w:r>
+      <w:r>
+        <w:lastRenderedPageBreak/>
+        <w:t>“</w:t>
       </w:r>
       <w:r>
         <w:t>Implementar una heurística propia propuesta por el alumno que intente compensar los costes asimétricos</w:t>
@@ -2796,17 +2812,59 @@
         <w:jc w:val="both"/>
       </w:pPr>
       <w:r>
-        <w:lastRenderedPageBreak/>
-        <w:t xml:space="preserve">Sin embargo, mirando los resultados del A* Mejorado en el MAPA_GRANDE, da un coste de 38 en vez de 32. Esto significa que la </w:t>
-      </w:r>
-      <w:r>
-        <w:t>heurística</w:t>
-      </w:r>
-      <w:r>
-        <w:t xml:space="preserve"> mejorada no es admisible en ese mapa</w:t>
+        <w:t>Sin embargo, mirando los resultados del A* Mejorado en el MAPA_GRANDE, da un coste de 38 en vez de 32. Esto significa que la heurística mejorada no es admisible en ese mapa</w:t>
       </w:r>
       <w:r>
         <w:t>. En los otros dos mapas si da el mejor resultado.</w:t>
+      </w:r>
+    </w:p>
+    <w:p>
+      <w:pPr>
+        <w:pStyle w:val="Prrafodelista"/>
+        <w:jc w:val="both"/>
+        <w:rPr>
+          <w:b/>
+          <w:bCs/>
+        </w:rPr>
+      </w:pPr>
+    </w:p>
+    <w:p>
+      <w:pPr>
+        <w:pStyle w:val="Prrafodelista"/>
+        <w:jc w:val="both"/>
+        <w:rPr>
+          <w:b/>
+          <w:bCs/>
+        </w:rPr>
+      </w:pPr>
+      <w:r>
+        <w:rPr>
+          <w:b/>
+          <w:bCs/>
+        </w:rPr>
+        <w:t>4.</w:t>
+      </w:r>
+      <w:r>
+        <w:rPr>
+          <w:b/>
+          <w:bCs/>
+        </w:rPr>
+        <w:t>4 Tratamiento de repetidos</w:t>
+      </w:r>
+    </w:p>
+    <w:p>
+      <w:pPr>
+        <w:pStyle w:val="Prrafodelista"/>
+        <w:jc w:val="both"/>
+      </w:pPr>
+      <w:r>
+        <w:t>En el tema 3, el psudocodgo incluye “</w:t>
+      </w:r>
+      <w:r>
+        <w:t>QuitarRepetidos(sucesores, Cerrados)</w:t>
+      </w:r>
+      <w:r>
+        <w:t>”, por lo que en mi código que implementado el tratamiento de repetidos de esa misma forma, en la clase Busqueda, comprobando que el sucesor ni esté ya ni en abiertos ni en cerrados y mostrando por pantalla el repetido descartado. Esto hace que el algoritmo no entre en un bucle infinito</w:t>
       </w:r>
     </w:p>
     <w:p>
@@ -2902,11 +2960,14 @@
     </w:p>
     <w:p>
       <w:r>
+        <w:rPr>
+          <w:noProof/>
+        </w:rPr>
         <w:drawing>
-          <wp:inline distT="0" distB="0" distL="0" distR="0" wp14:anchorId="1BAFBF25" wp14:editId="63B51E3C">
-            <wp:extent cx="5400040" cy="1198880"/>
-            <wp:effectExtent l="0" t="0" r="0" b="1270"/>
-            <wp:docPr id="1337002151" name="Imagen 1"/>
+          <wp:inline distT="0" distB="0" distL="0" distR="0" wp14:anchorId="0CF99915" wp14:editId="15EF5E01">
+            <wp:extent cx="5400040" cy="1212215"/>
+            <wp:effectExtent l="0" t="0" r="0" b="6985"/>
+            <wp:docPr id="1805216511" name="Imagen 1"/>
             <wp:cNvGraphicFramePr>
               <a:graphicFrameLocks xmlns:a="http://schemas.openxmlformats.org/drawingml/2006/main" noChangeAspect="1"/>
             </wp:cNvGraphicFramePr>
@@ -2914,7 +2975,7 @@
               <a:graphicData uri="http://schemas.openxmlformats.org/drawingml/2006/picture">
                 <pic:pic xmlns:pic="http://schemas.openxmlformats.org/drawingml/2006/picture">
                   <pic:nvPicPr>
-                    <pic:cNvPr id="1337002151" name=""/>
+                    <pic:cNvPr id="1805216511" name=""/>
                     <pic:cNvPicPr/>
                   </pic:nvPicPr>
                   <pic:blipFill>
@@ -2926,7 +2987,7 @@
                   <pic:spPr>
                     <a:xfrm>
                       <a:off x="0" y="0"/>
-                      <a:ext cx="5400040" cy="1198880"/>
+                      <a:ext cx="5400040" cy="1212215"/>
                     </a:xfrm>
                     <a:prstGeom prst="rect">
                       <a:avLst/>
@@ -2941,11 +3002,14 @@
     </w:p>
     <w:p>
       <w:r>
+        <w:rPr>
+          <w:noProof/>
+        </w:rPr>
         <w:drawing>
-          <wp:inline distT="0" distB="0" distL="0" distR="0" wp14:anchorId="0AF4727B" wp14:editId="6DBBB8E1">
-            <wp:extent cx="5400040" cy="1203960"/>
+          <wp:inline distT="0" distB="0" distL="0" distR="0" wp14:anchorId="08FFEF07" wp14:editId="241C9E92">
+            <wp:extent cx="5400040" cy="1247140"/>
             <wp:effectExtent l="0" t="0" r="0" b="0"/>
-            <wp:docPr id="2118437320" name="Imagen 1"/>
+            <wp:docPr id="497182057" name="Imagen 1"/>
             <wp:cNvGraphicFramePr>
               <a:graphicFrameLocks xmlns:a="http://schemas.openxmlformats.org/drawingml/2006/main" noChangeAspect="1"/>
             </wp:cNvGraphicFramePr>
@@ -2953,7 +3017,7 @@
               <a:graphicData uri="http://schemas.openxmlformats.org/drawingml/2006/picture">
                 <pic:pic xmlns:pic="http://schemas.openxmlformats.org/drawingml/2006/picture">
                   <pic:nvPicPr>
-                    <pic:cNvPr id="2118437320" name=""/>
+                    <pic:cNvPr id="497182057" name=""/>
                     <pic:cNvPicPr/>
                   </pic:nvPicPr>
                   <pic:blipFill>
@@ -2965,7 +3029,7 @@
                   <pic:spPr>
                     <a:xfrm>
                       <a:off x="0" y="0"/>
-                      <a:ext cx="5400040" cy="1203960"/>
+                      <a:ext cx="5400040" cy="1247140"/>
                     </a:xfrm>
                     <a:prstGeom prst="rect">
                       <a:avLst/>
@@ -2980,11 +3044,15 @@
     </w:p>
     <w:p>
       <w:r>
+        <w:rPr>
+          <w:noProof/>
+        </w:rPr>
+        <w:lastRenderedPageBreak/>
         <w:drawing>
-          <wp:inline distT="0" distB="0" distL="0" distR="0" wp14:anchorId="05AA83D5" wp14:editId="4293E681">
-            <wp:extent cx="5400040" cy="1240155"/>
+          <wp:inline distT="0" distB="0" distL="0" distR="0" wp14:anchorId="58C0749C" wp14:editId="6DD688D4">
+            <wp:extent cx="5400040" cy="1238885"/>
             <wp:effectExtent l="0" t="0" r="0" b="0"/>
-            <wp:docPr id="1566344538" name="Imagen 1"/>
+            <wp:docPr id="156930119" name="Imagen 1"/>
             <wp:cNvGraphicFramePr>
               <a:graphicFrameLocks xmlns:a="http://schemas.openxmlformats.org/drawingml/2006/main" noChangeAspect="1"/>
             </wp:cNvGraphicFramePr>
@@ -2992,7 +3060,7 @@
               <a:graphicData uri="http://schemas.openxmlformats.org/drawingml/2006/picture">
                 <pic:pic xmlns:pic="http://schemas.openxmlformats.org/drawingml/2006/picture">
                   <pic:nvPicPr>
-                    <pic:cNvPr id="1566344538" name=""/>
+                    <pic:cNvPr id="156930119" name=""/>
                     <pic:cNvPicPr/>
                   </pic:nvPicPr>
                   <pic:blipFill>
@@ -3004,7 +3072,7 @@
                   <pic:spPr>
                     <a:xfrm>
                       <a:off x="0" y="0"/>
-                      <a:ext cx="5400040" cy="1240155"/>
+                      <a:ext cx="5400040" cy="1238885"/>
                     </a:xfrm>
                     <a:prstGeom prst="rect">
                       <a:avLst/>
@@ -3019,11 +3087,14 @@
     </w:p>
     <w:p>
       <w:r>
+        <w:rPr>
+          <w:noProof/>
+        </w:rPr>
         <w:drawing>
-          <wp:inline distT="0" distB="0" distL="0" distR="0" wp14:anchorId="6B64FB97" wp14:editId="6DA3D0AD">
-            <wp:extent cx="5400040" cy="1184275"/>
-            <wp:effectExtent l="0" t="0" r="0" b="0"/>
-            <wp:docPr id="1202100771" name="Imagen 1"/>
+          <wp:inline distT="0" distB="0" distL="0" distR="0" wp14:anchorId="7634AF5F" wp14:editId="0A499B4C">
+            <wp:extent cx="5400040" cy="1215390"/>
+            <wp:effectExtent l="0" t="0" r="0" b="3810"/>
+            <wp:docPr id="298316141" name="Imagen 1"/>
             <wp:cNvGraphicFramePr>
               <a:graphicFrameLocks xmlns:a="http://schemas.openxmlformats.org/drawingml/2006/main" noChangeAspect="1"/>
             </wp:cNvGraphicFramePr>
@@ -3031,7 +3102,7 @@
               <a:graphicData uri="http://schemas.openxmlformats.org/drawingml/2006/picture">
                 <pic:pic xmlns:pic="http://schemas.openxmlformats.org/drawingml/2006/picture">
                   <pic:nvPicPr>
-                    <pic:cNvPr id="1202100771" name=""/>
+                    <pic:cNvPr id="298316141" name=""/>
                     <pic:cNvPicPr/>
                   </pic:nvPicPr>
                   <pic:blipFill>
@@ -3043,7 +3114,7 @@
                   <pic:spPr>
                     <a:xfrm>
                       <a:off x="0" y="0"/>
-                      <a:ext cx="5400040" cy="1184275"/>
+                      <a:ext cx="5400040" cy="1215390"/>
                     </a:xfrm>
                     <a:prstGeom prst="rect">
                       <a:avLst/>

</xml_diff>